<commit_message>
Improved break system at Pascal level
</commit_message>
<xml_diff>
--- a/Manuals/R65 REFERENCE GUIDE.docx
+++ b/Manuals/R65 REFERENCE GUIDE.docx
@@ -2995,10 +2995,7 @@
       <w:bookmarkStart w:id="5" w:name="_Toc226582333"/>
       <w:bookmarkStart w:id="6" w:name="_Toc226583156"/>
       <w:r>
-        <w:t xml:space="preserve">• </w:t>
-      </w:r>
-      <w:r>
-        <w:t>Multiple versions of a file can be kept on disk (</w:t>
+        <w:t>• Multiple versions of a file can be kept on disk (</w:t>
       </w:r>
       <w:proofErr w:type="spellStart"/>
       <w:r>
@@ -6729,6 +6726,14 @@
               <w:t>29</w:t>
             </w:r>
           </w:p>
+          <w:p>
+            <w:pPr>
+              <w:spacing w:after="120" w:line="240" w:lineRule="auto"/>
+            </w:pPr>
+            <w:r>
+              <w:t>40-52</w:t>
+            </w:r>
+          </w:p>
         </w:tc>
         <w:tc>
           <w:tcPr>
@@ -6740,6 +6745,14 @@
             </w:pPr>
             <w:r>
               <w:t>File not open for random access write</w:t>
+            </w:r>
+          </w:p>
+          <w:p>
+            <w:pPr>
+              <w:spacing w:after="120" w:line="240" w:lineRule="auto"/>
+            </w:pPr>
+            <w:r>
+              <w:t>See top of assembler source file</w:t>
             </w:r>
           </w:p>
         </w:tc>
@@ -6951,6 +6964,7 @@
               <w:spacing w:after="120" w:line="240" w:lineRule="auto"/>
             </w:pPr>
             <w:r>
+              <w:lastRenderedPageBreak/>
               <w:t>65</w:t>
             </w:r>
           </w:p>
@@ -6984,7 +6998,6 @@
               <w:spacing w:after="120" w:line="240" w:lineRule="auto"/>
             </w:pPr>
             <w:r>
-              <w:lastRenderedPageBreak/>
               <w:t>66</w:t>
             </w:r>
           </w:p>

</xml_diff>